<commit_message>
feat: import category support
</commit_message>
<xml_diff>
--- a/admin/templates/notes-import-template.docx
+++ b/admin/templates/notes-import-template.docx
@@ -12,22 +12,22 @@
     </w:p>
     <w:p>
       <w:r>
-        <w:t>这是用 Word 模板导入的示例。一级标题=文章标题；二级标题=折叠章节；三级标题=小节小标题。</w:t>
-      </w:r>
-    </w:p>
-    <w:p>
-      <w:r>
-        <w:t>菜单简介：Word模板示例文章</w:t>
-      </w:r>
-    </w:p>
-    <w:p>
-      <w:r>
         <w:t>ID: demo-office-word</w:t>
       </w:r>
     </w:p>
     <w:p>
       <w:r>
-        <w:t>INTRO: 文首说明可写在这里，导入时会识别。</w:t>
+        <w:t>CATEGORY: 学习</w:t>
+      </w:r>
+    </w:p>
+    <w:p>
+      <w:r>
+        <w:t>DESC: Word模板示例文章</w:t>
+      </w:r>
+    </w:p>
+    <w:p>
+      <w:r>
+        <w:t>INTRO: 文首说明写在这里</w:t>
       </w:r>
     </w:p>
     <w:p>
@@ -48,31 +48,17 @@
     </w:p>
     <w:p>
       <w:r>
-        <w:t>这里写普通段落说明。</w:t>
+        <w:t>普通段落说明。</w:t>
       </w:r>
     </w:p>
     <w:p>
       <w:r>
-        <w:rPr>
-          <w:rFonts w:ascii="Consolas" w:hAnsi="Consolas"/>
-          <w:sz w:val="22"/>
-        </w:rPr>
-        <w:t>SELECT TOP 10 * FROM dbo.tb_bas_mold;</w:t>
+        <w:t>[TIP] 提示类内容</w:t>
       </w:r>
     </w:p>
     <w:p>
       <w:r>
-        <w:t>[TIP] 提示类内容：以 [TIP] 开头的段落会变成 tip 卡片。</w:t>
-      </w:r>
-    </w:p>
-    <w:p>
-      <w:r>
-        <w:t>[WARNING] 警告类内容：以 [WARNING] 开头。</w:t>
-      </w:r>
-    </w:p>
-    <w:p>
-      <w:r>
-        <w:t>[INFO] 信息类内容：以 [INFO] 开头。</w:t>
+        <w:t>[WARNING] 警告类内容</w:t>
       </w:r>
     </w:p>
     <w:p>
@@ -86,11 +72,6 @@
       </w:r>
     </w:p>
     <w:p>
-      <w:r>
-        <w:t>- 列表项 C</w:t>
-      </w:r>
-    </w:p>
-    <w:p>
       <w:pPr>
         <w:pStyle w:val="Heading2"/>
       </w:pPr>
@@ -100,37 +81,12 @@
     </w:p>
     <w:p>
       <w:r>
-        <w:t>同一二级标题下的内容会自动归入同一折叠章节。</w:t>
-      </w:r>
-    </w:p>
-    <w:p>
-      <w:r>
         <w:t>[CODE]</w:t>
       </w:r>
     </w:p>
     <w:p>
       <w:r>
-        <w:t>CREATE PROCEDURE dbo.demo_sp</w:t>
-      </w:r>
-    </w:p>
-    <w:p>
-      <w:r>
-        <w:t>AS</w:t>
-      </w:r>
-    </w:p>
-    <w:p>
-      <w:r>
-        <w:t>BEGIN</w:t>
-      </w:r>
-    </w:p>
-    <w:p>
-      <w:r>
-        <w:t xml:space="preserve">    SELECT 1;</w:t>
-      </w:r>
-    </w:p>
-    <w:p>
-      <w:r>
-        <w:t>END</w:t>
+        <w:t>SELECT TOP 10 * FROM dbo.demo;</w:t>
       </w:r>
     </w:p>
     <w:p>
@@ -140,27 +96,7 @@
     </w:p>
     <w:p>
       <w:r>
-        <w:t>—— 填写说明 ——</w:t>
-      </w:r>
-    </w:p>
-    <w:p>
-      <w:r>
-        <w:t>1. 文章标题用「标题1」；折叠章节用「标题2」；小节用「标题3」。</w:t>
-      </w:r>
-    </w:p>
-    <w:p>
-      <w:r>
-        <w:t>2. 可选元数据行：ID: your-id / INTRO: 文首说明 / DESC: 菜单简介</w:t>
-      </w:r>
-    </w:p>
-    <w:p>
-      <w:r>
-        <w:t>3. 特殊段落前缀：[TIP] [WARNING] [INFO]；代码块用 [CODE] ... [/CODE] 包裹。</w:t>
-      </w:r>
-    </w:p>
-    <w:p>
-      <w:r>
-        <w:t>4. 以 - 或 * 开头的行会识别为列表。</w:t>
+        <w:t>说明：CATEGORY 可写 工作/学习/娱乐 或 work/study/fun；也可用 栏目: 学习</w:t>
       </w:r>
     </w:p>
     <w:sectPr>

</xml_diff>